<commit_message>
Publish v9 release, masking-family investigation and acceptance status
v9 adds one Introduction sentence linking self-supervised pretraining to
medical imaging foundation models; all 13 release gates passed (8 main /
15 total pages). Commit the masking-family diagnostics, earlier release
handoffs and the resource monitor log so main holds the full record.

Co-authored-by: Copilot <223556219+Copilot@users.noreply.github.com>
Copilot-Session: 4dd84b82-282c-4eff-9f95-5f93a1ff1d8b
</commit_message>
<xml_diff>
--- a/paper/genai4health2026/main_submission.docx
+++ b/paper/genai4health2026/main_submission.docx
@@ -193,7 +193,7 @@
         <w:br/>
       </w:r>
       <w:r>
-        <w:t xml:space="preserve">The LaTeX source is authoritative. Generated 2026-09-10 11:59 UTC. Numeric evidence coverage is recorded separately; conversion is not scientific validation. Please raise numeric changes as comments.</w:t>
+        <w:t xml:space="preserve">The LaTeX source is authoritative. Generated 2026-09-10 12:48 UTC. Numeric evidence coverage is recorded separately; conversion is not scientific validation. Please raise numeric changes as comments.</w:t>
       </w:r>
     </w:p>
     <w:bookmarkStart w:id="14" w:name="fig:target_selection"/>
@@ -424,13 +424,19 @@
         <w:t xml:space="preserve"> </w:t>
       </w:r>
       <w:r>
-        <w:t xml:space="preserve">Self-supervised pretraining offers a way to learn from these images without</w:t>
-      </w:r>
-      <w:r>
-        <w:t xml:space="preserve"> </w:t>
-      </w:r>
-      <w:r>
-        <w:t xml:space="preserve">requiring a diagnosis for every training scan </w:t>
+        <w:t xml:space="preserve">Self-supervised pretraining supports medical imaging foundation models by</w:t>
+      </w:r>
+      <w:r>
+        <w:t xml:space="preserve"> </w:t>
+      </w:r>
+      <w:r>
+        <w:t xml:space="preserve">learning reusable representations without requiring a diagnosis for every</w:t>
+      </w:r>
+      <w:r>
+        <w:t xml:space="preserve"> </w:t>
+      </w:r>
+      <w:r>
+        <w:t xml:space="preserve">training scan </w:t>
       </w:r>
       <w:r>
         <w:t xml:space="preserve">(</w:t>

</xml_diff>